<commit_message>
docs: point revenue guide's Supabase section at the planned CSV export, not raw DB access
Giving Jan direct Table Editor access to profiles would expose the whole
production table (all member emails, etc.) to a non-technical bookkeeper,
which doesn't fit how we've treated member data everywhere else on this
project. Section 5 now describes the biweekly automatic CSV email instead
(still to be built) and the matching screenshot placeholder is updated to
match.
</commit_message>
<xml_diff>
--- a/docs/revenue-reconciliation-guide.docx
+++ b/docs/revenue-reconciliation-guide.docx
@@ -1159,25 +1159,25 @@
           <w:sz w:val="22"/>
           <w:szCs w:val="22"/>
         </w:rPr>
-        <w:t xml:space="preserve">. Use it only to confirm “is this person actually an active member?” against a payment. Open </w:t>
-      </w:r>
-      <w:r>
-        <w:rPr>
-          <w:b/>
-          <w:bCs/>
-          <w:color w:val="1C1007"/>
-          <w:sz w:val="22"/>
-          <w:szCs w:val="22"/>
-        </w:rPr>
-        <w:t xml:space="preserve">Table Editor → profiles</w:t>
-      </w:r>
-      <w:r>
-        <w:rPr>
-          <w:color w:val="1C1007"/>
-          <w:sz w:val="22"/>
-          <w:szCs w:val="22"/>
-        </w:rPr>
-        <w:t xml:space="preserve"> to see each member’s email, tier (The Calm Connection / The Calm Circle), and status (active / past due / inactive).</w:t>
+        <w:t xml:space="preserve">, used only to confirm “is this person actually an active member?” against a payment. Rather than logging into Supabase directly, Jan and Jez will get an </w:t>
+      </w:r>
+      <w:r>
+        <w:rPr>
+          <w:b/>
+          <w:bCs/>
+          <w:color w:val="1C1007"/>
+          <w:sz w:val="22"/>
+          <w:szCs w:val="22"/>
+        </w:rPr>
+        <w:t xml:space="preserve">automatic email every two weeks</w:t>
+      </w:r>
+      <w:r>
+        <w:rPr>
+          <w:color w:val="1C1007"/>
+          <w:sz w:val="22"/>
+          <w:szCs w:val="22"/>
+        </w:rPr>
+        <w:t xml:space="preserve"> with a simple spreadsheet of the same information — each member’s email, tier (The Calm Connection / The Calm Circle), and status (active / past due / inactive). No login or database access needed.</w:t>
       </w:r>
     </w:p>
     <w:p>
@@ -1207,7 +1207,7 @@
           <w:sz w:val="22"/>
           <w:szCs w:val="22"/>
         </w:rPr>
-        <w:t xml:space="preserve">Supabase → Table Editor → profiles table (email, role/tier, subscription status columns).</w:t>
+        <w:t xml:space="preserve">Example of the spreadsheet Jan and Jez will receive by email (once the automatic export is set up).</w:t>
       </w:r>
     </w:p>
     <w:p>

</xml_diff>

<commit_message>
docs: add verified PayPal read-only access steps to the revenue guide
Section 4 previously only covered where to look, unlike the Stripe
section which also explains getting Jan her own login. Added the same
"a) Getting Jan her own access" pattern, verified against PayPal's own
Business account help article: Account Settings -> Manage users -> Add
user, and the balance-view vs. reports-download permissions can't be
combined on one login (two limited logins if she needs both).
</commit_message>
<xml_diff>
--- a/docs/revenue-reconciliation-guide.docx
+++ b/docs/revenue-reconciliation-guide.docx
@@ -1033,6 +1033,135 @@
     </w:p>
     <w:p>
       <w:pPr>
+        <w:pStyle w:val="Heading2"/>
+        <w:spacing w:after="100" w:before="220"/>
+      </w:pPr>
+      <w:r>
+        <w:rPr>
+          <w:b/>
+          <w:bCs/>
+          <w:color w:val="1C1007"/>
+          <w:sz w:val="25"/>
+          <w:szCs w:val="25"/>
+        </w:rPr>
+        <w:t xml:space="preserve">a) Getting Jan her own access (view-only)</w:t>
+      </w:r>
+    </w:p>
+    <w:p>
+      <w:pPr>
+        <w:spacing w:after="140" w:line="276"/>
+      </w:pPr>
+      <w:r>
+        <w:rPr>
+          <w:color w:val="1C1007"/>
+          <w:sz w:val="22"/>
+          <w:szCs w:val="22"/>
+        </w:rPr>
+        <w:t xml:space="preserve">To give Jan her own login, add her under </w:t>
+      </w:r>
+      <w:r>
+        <w:rPr>
+          <w:b/>
+          <w:bCs/>
+          <w:color w:val="1C1007"/>
+          <w:sz w:val="22"/>
+          <w:szCs w:val="22"/>
+        </w:rPr>
+        <w:t xml:space="preserve">Account Settings → Manage users → Add user</w:t>
+      </w:r>
+      <w:r>
+        <w:rPr>
+          <w:color w:val="1C1007"/>
+          <w:sz w:val="22"/>
+          <w:szCs w:val="22"/>
+        </w:rPr>
+        <w:t xml:space="preserve">, then choose her privileges. PayPal is a bit more restrictive than Stripe here: a user can be given permission to </w:t>
+      </w:r>
+      <w:r>
+        <w:rPr>
+          <w:b/>
+          <w:bCs/>
+          <w:color w:val="1C1007"/>
+          <w:sz w:val="22"/>
+          <w:szCs w:val="22"/>
+        </w:rPr>
+        <w:t xml:space="preserve">view the account balance</w:t>
+      </w:r>
+      <w:r>
+        <w:rPr>
+          <w:color w:val="1C1007"/>
+          <w:sz w:val="22"/>
+          <w:szCs w:val="22"/>
+        </w:rPr>
+        <w:t xml:space="preserve">, or separately, permission to </w:t>
+      </w:r>
+      <w:r>
+        <w:rPr>
+          <w:b/>
+          <w:bCs/>
+          <w:color w:val="1C1007"/>
+          <w:sz w:val="22"/>
+          <w:szCs w:val="22"/>
+        </w:rPr>
+        <w:t xml:space="preserve">run and download reports</w:t>
+      </w:r>
+      <w:r>
+        <w:rPr>
+          <w:color w:val="1C1007"/>
+          <w:sz w:val="22"/>
+          <w:szCs w:val="22"/>
+        </w:rPr>
+        <w:t xml:space="preserve"> — PayPal doesn’t allow combining those two on one login. If Jan needs both, the simple fix is two limited logins for her (one for balance, one for reports); either way, she never gets permission to move money.</w:t>
+      </w:r>
+    </w:p>
+    <w:p>
+      <w:pPr>
+        <w:pBdr>
+          <w:top w:val="dashed" w:color="467826" w:sz="6" w:space="6"/>
+          <w:bottom w:val="dashed" w:color="467826" w:sz="6" w:space="6"/>
+          <w:left w:val="dashed" w:color="467826" w:sz="6" w:space="6"/>
+          <w:right w:val="dashed" w:color="467826" w:sz="6" w:space="6"/>
+        </w:pBdr>
+        <w:shd w:fill="EFF4E9" w:color="auto" w:val="clear"/>
+        <w:spacing w:after="200" w:before="60" w:line="264"/>
+      </w:pPr>
+      <w:r>
+        <w:rPr>
+          <w:b/>
+          <w:bCs/>
+          <w:color w:val="467826"/>
+          <w:sz w:val="22"/>
+          <w:szCs w:val="22"/>
+        </w:rPr>
+        <w:t xml:space="preserve">📸  Screenshot to add here: </w:t>
+      </w:r>
+      <w:r>
+        <w:rPr>
+          <w:color w:val="1C1007"/>
+          <w:sz w:val="22"/>
+          <w:szCs w:val="22"/>
+        </w:rPr>
+        <w:t xml:space="preserve">PayPal → Account Settings → Manage Users, showing the Add User button and the privilege checkboxes.</w:t>
+      </w:r>
+    </w:p>
+    <w:p>
+      <w:pPr>
+        <w:pStyle w:val="Heading2"/>
+        <w:spacing w:after="100" w:before="220"/>
+      </w:pPr>
+      <w:r>
+        <w:rPr>
+          <w:b/>
+          <w:bCs/>
+          <w:color w:val="1C1007"/>
+          <w:sz w:val="25"/>
+          <w:szCs w:val="25"/>
+        </w:rPr>
+        <w:t xml:space="preserve">b) Seeing what’s there</w:t>
+      </w:r>
+    </w:p>
+    <w:p>
+      <w:pPr>
         <w:pStyle w:val="ListParagraph"/>
         <w:numPr>
           <w:ilvl w:val="0"/>

</xml_diff>

<commit_message>
docs(revenue-guide): add live Stripe/PayPal screenshots, PDF export
Filled in 5 of 6 screenshot placeholders with real captures from the
production dashboards (Stripe Payments/Payouts/Export, PayPal Manage
Users/Activity). Corrected the Stripe role wording to match what was
actually used (Accountant, not generic "read-only"). Only the Supabase
CSV example placeholder remains, pending the member-export cron's
cadence/recipient being finalized.
</commit_message>
<xml_diff>
--- a/docs/revenue-reconciliation-guide.docx
+++ b/docs/revenue-reconciliation-guide.docx
@@ -687,7 +687,7 @@
           <w:sz w:val="22"/>
           <w:szCs w:val="22"/>
         </w:rPr>
-        <w:t xml:space="preserve">Click “Invite”, enter Jan’s email, and choose a read-only / Analyst role (view + export, no changes).</w:t>
+        <w:t xml:space="preserve">Click “Invite”, enter Jan’s email, and choose the Accountant role (view + export, no changes — this is the role we actually used).</w:t>
       </w:r>
     </w:p>
     <w:p>
@@ -709,15 +709,14 @@
           <w:sz w:val="22"/>
           <w:szCs w:val="22"/>
         </w:rPr>
-        <w:t xml:space="preserve">📸  Screenshot to add here: </w:t>
-      </w:r>
-      <w:r>
-        <w:rPr>
-          <w:color w:val="1C1007"/>
-          <w:sz w:val="22"/>
-          <w:szCs w:val="22"/>
-        </w:rPr>
-        <w:t xml:space="preserve">Stripe → Settings → Team, showing the Invite button and the role choices.</w:t>
+      </w:r>
+      <w:r>
+        <w:rPr>
+          <w:color w:val="1C1007"/>
+          <w:sz w:val="22"/>
+          <w:szCs w:val="22"/>
+        </w:rPr>
+        <w:t xml:space="preserve">✅ Already done — Jan and Jez were both invited via Tapas’s Stripe account (Jan as Accountant, Jez as Analyst).</w:t>
       </w:r>
     </w:p>
     <w:p>
@@ -809,15 +808,50 @@
           <w:sz w:val="22"/>
           <w:szCs w:val="22"/>
         </w:rPr>
-        <w:t xml:space="preserve">📸  Screenshot to add here: </w:t>
-      </w:r>
-      <w:r>
-        <w:rPr>
-          <w:color w:val="1C1007"/>
-          <w:sz w:val="22"/>
-          <w:szCs w:val="22"/>
-        </w:rPr>
-        <w:t xml:space="preserve">Stripe → Payments list for the current month (customer / amount / date / status columns visible).</w:t>
+        <w:t>Stripe → Payments list for the current month.</w:t>
+      </w:r>
+      <w:r>
+        <w:rPr>
+          <w:color w:val="1C1007"/>
+          <w:sz w:val="22"/>
+          <w:szCs w:val="22"/>
+        </w:rPr>
+      </w:r>
+    </w:p>
+    <w:p>
+      <w:r>
+        <w:drawing>
+          <wp:inline xmlns:a="http://schemas.openxmlformats.org/drawingml/2006/main" xmlns:pic="http://schemas.openxmlformats.org/drawingml/2006/picture">
+            <wp:extent cx="5486400" cy="2875900"/>
+            <wp:docPr id="1" name="Picture 1"/>
+            <wp:cNvGraphicFramePr>
+              <a:graphicFrameLocks noChangeAspect="1"/>
+            </wp:cNvGraphicFramePr>
+            <a:graphic>
+              <a:graphicData uri="http://schemas.openxmlformats.org/drawingml/2006/picture">
+                <pic:pic>
+                  <pic:nvPicPr>
+                    <pic:cNvPr id="0" name="Screenshot 2026-08-07 181543.png"/>
+                    <pic:cNvPicPr/>
+                  </pic:nvPicPr>
+                  <pic:blipFill>
+                    <a:blip r:embed="rId8"/>
+                    <a:stretch>
+                      <a:fillRect/>
+                    </a:stretch>
+                  </pic:blipFill>
+                  <pic:spPr>
+                    <a:xfrm>
+                      <a:off x="0" y="0"/>
+                      <a:ext cx="5486400" cy="2875900"/>
+                    </a:xfrm>
+                    <a:prstGeom prst="rect"/>
+                  </pic:spPr>
+                </pic:pic>
+              </a:graphicData>
+            </a:graphic>
+          </wp:inline>
+        </w:drawing>
       </w:r>
     </w:p>
     <w:p>
@@ -891,15 +925,50 @@
           <w:sz w:val="22"/>
           <w:szCs w:val="22"/>
         </w:rPr>
-        <w:t xml:space="preserve">📸  Screenshot to add here: </w:t>
-      </w:r>
-      <w:r>
-        <w:rPr>
-          <w:color w:val="1C1007"/>
-          <w:sz w:val="22"/>
-          <w:szCs w:val="22"/>
-        </w:rPr>
-        <w:t xml:space="preserve">Stripe → Balance → Payouts, showing a payout and its “included transactions”.</w:t>
+        <w:t>Stripe → Balance → Payouts, showing a payout and its included transactions.</w:t>
+      </w:r>
+      <w:r>
+        <w:rPr>
+          <w:color w:val="1C1007"/>
+          <w:sz w:val="22"/>
+          <w:szCs w:val="22"/>
+        </w:rPr>
+      </w:r>
+    </w:p>
+    <w:p>
+      <w:r>
+        <w:drawing>
+          <wp:inline xmlns:a="http://schemas.openxmlformats.org/drawingml/2006/main" xmlns:pic="http://schemas.openxmlformats.org/drawingml/2006/picture">
+            <wp:extent cx="5486400" cy="2874245"/>
+            <wp:docPr id="2" name="Picture 2"/>
+            <wp:cNvGraphicFramePr>
+              <a:graphicFrameLocks noChangeAspect="1"/>
+            </wp:cNvGraphicFramePr>
+            <a:graphic>
+              <a:graphicData uri="http://schemas.openxmlformats.org/drawingml/2006/picture">
+                <pic:pic>
+                  <pic:nvPicPr>
+                    <pic:cNvPr id="0" name="Screenshot 2026-08-07 181044.png"/>
+                    <pic:cNvPicPr/>
+                  </pic:nvPicPr>
+                  <pic:blipFill>
+                    <a:blip r:embed="rId9"/>
+                    <a:stretch>
+                      <a:fillRect/>
+                    </a:stretch>
+                  </pic:blipFill>
+                  <pic:spPr>
+                    <a:xfrm>
+                      <a:off x="0" y="0"/>
+                      <a:ext cx="5486400" cy="2874245"/>
+                    </a:xfrm>
+                    <a:prstGeom prst="rect"/>
+                  </pic:spPr>
+                </pic:pic>
+              </a:graphicData>
+            </a:graphic>
+          </wp:inline>
+        </w:drawing>
       </w:r>
     </w:p>
     <w:p>
@@ -1004,15 +1073,50 @@
           <w:sz w:val="22"/>
           <w:szCs w:val="22"/>
         </w:rPr>
-        <w:t xml:space="preserve">📸  Screenshot to add here: </w:t>
-      </w:r>
-      <w:r>
-        <w:rPr>
-          <w:color w:val="1C1007"/>
-          <w:sz w:val="22"/>
-          <w:szCs w:val="22"/>
-        </w:rPr>
-        <w:t xml:space="preserve">Stripe → the Export button and the column / date-range options.</w:t>
+        <w:t>Stripe → the Export button, date range, and column options.</w:t>
+      </w:r>
+      <w:r>
+        <w:rPr>
+          <w:color w:val="1C1007"/>
+          <w:sz w:val="22"/>
+          <w:szCs w:val="22"/>
+        </w:rPr>
+      </w:r>
+    </w:p>
+    <w:p>
+      <w:r>
+        <w:drawing>
+          <wp:inline xmlns:a="http://schemas.openxmlformats.org/drawingml/2006/main" xmlns:pic="http://schemas.openxmlformats.org/drawingml/2006/picture">
+            <wp:extent cx="5486400" cy="2850524"/>
+            <wp:docPr id="5" name="Picture 5"/>
+            <wp:cNvGraphicFramePr>
+              <a:graphicFrameLocks noChangeAspect="1"/>
+            </wp:cNvGraphicFramePr>
+            <a:graphic>
+              <a:graphicData uri="http://schemas.openxmlformats.org/drawingml/2006/picture">
+                <pic:pic>
+                  <pic:nvPicPr>
+                    <pic:cNvPr id="0" name="Screenshot 2026-08-09 165109.png"/>
+                    <pic:cNvPicPr/>
+                  </pic:nvPicPr>
+                  <pic:blipFill>
+                    <a:blip r:embed="rId12"/>
+                    <a:stretch>
+                      <a:fillRect/>
+                    </a:stretch>
+                  </pic:blipFill>
+                  <pic:spPr>
+                    <a:xfrm>
+                      <a:off x="0" y="0"/>
+                      <a:ext cx="5486400" cy="2850524"/>
+                    </a:xfrm>
+                    <a:prstGeom prst="rect"/>
+                  </pic:spPr>
+                </pic:pic>
+              </a:graphicData>
+            </a:graphic>
+          </wp:inline>
+        </w:drawing>
       </w:r>
     </w:p>
     <w:p>
@@ -1133,15 +1237,50 @@
           <w:sz w:val="22"/>
           <w:szCs w:val="22"/>
         </w:rPr>
-        <w:t xml:space="preserve">📸  Screenshot to add here: </w:t>
-      </w:r>
-      <w:r>
-        <w:rPr>
-          <w:color w:val="1C1007"/>
-          <w:sz w:val="22"/>
-          <w:szCs w:val="22"/>
-        </w:rPr>
-        <w:t xml:space="preserve">PayPal → Account Settings → Manage Users, showing the Add User button and the privilege checkboxes.</w:t>
+        <w:t>PayPal → Account Settings → Manage Users.</w:t>
+      </w:r>
+      <w:r>
+        <w:rPr>
+          <w:color w:val="1C1007"/>
+          <w:sz w:val="22"/>
+          <w:szCs w:val="22"/>
+        </w:rPr>
+      </w:r>
+    </w:p>
+    <w:p>
+      <w:r>
+        <w:drawing>
+          <wp:inline xmlns:a="http://schemas.openxmlformats.org/drawingml/2006/main" xmlns:pic="http://schemas.openxmlformats.org/drawingml/2006/picture">
+            <wp:extent cx="5486400" cy="2865703"/>
+            <wp:docPr id="3" name="Picture 3"/>
+            <wp:cNvGraphicFramePr>
+              <a:graphicFrameLocks noChangeAspect="1"/>
+            </wp:cNvGraphicFramePr>
+            <a:graphic>
+              <a:graphicData uri="http://schemas.openxmlformats.org/drawingml/2006/picture">
+                <pic:pic>
+                  <pic:nvPicPr>
+                    <pic:cNvPr id="0" name="Screenshot 2026-08-09 163359.png"/>
+                    <pic:cNvPicPr/>
+                  </pic:nvPicPr>
+                  <pic:blipFill>
+                    <a:blip r:embed="rId10"/>
+                    <a:stretch>
+                      <a:fillRect/>
+                    </a:stretch>
+                  </pic:blipFill>
+                  <pic:spPr>
+                    <a:xfrm>
+                      <a:off x="0" y="0"/>
+                      <a:ext cx="5486400" cy="2865703"/>
+                    </a:xfrm>
+                    <a:prstGeom prst="rect"/>
+                  </pic:spPr>
+                </pic:pic>
+              </a:graphicData>
+            </a:graphic>
+          </wp:inline>
+        </w:drawing>
       </w:r>
     </w:p>
     <w:p>
@@ -1233,15 +1372,50 @@
           <w:sz w:val="22"/>
           <w:szCs w:val="22"/>
         </w:rPr>
-        <w:t xml:space="preserve">📸  Screenshot to add here: </w:t>
-      </w:r>
-      <w:r>
-        <w:rPr>
-          <w:color w:val="1C1007"/>
-          <w:sz w:val="22"/>
-          <w:szCs w:val="22"/>
-        </w:rPr>
-        <w:t xml:space="preserve">PayPal → Activity (or Reports), showing the current month’s transactions and the Download button.</w:t>
+        <w:t>PayPal → Activity, showing this month's transactions and the Download button.</w:t>
+      </w:r>
+      <w:r>
+        <w:rPr>
+          <w:color w:val="1C1007"/>
+          <w:sz w:val="22"/>
+          <w:szCs w:val="22"/>
+        </w:rPr>
+      </w:r>
+    </w:p>
+    <w:p>
+      <w:r>
+        <w:drawing>
+          <wp:inline xmlns:a="http://schemas.openxmlformats.org/drawingml/2006/main" xmlns:pic="http://schemas.openxmlformats.org/drawingml/2006/picture">
+            <wp:extent cx="5486400" cy="3092097"/>
+            <wp:docPr id="4" name="Picture 4"/>
+            <wp:cNvGraphicFramePr>
+              <a:graphicFrameLocks noChangeAspect="1"/>
+            </wp:cNvGraphicFramePr>
+            <a:graphic>
+              <a:graphicData uri="http://schemas.openxmlformats.org/drawingml/2006/picture">
+                <pic:pic>
+                  <pic:nvPicPr>
+                    <pic:cNvPr id="0" name="Screenshot 2026-08-09 163538.png"/>
+                    <pic:cNvPicPr/>
+                  </pic:nvPicPr>
+                  <pic:blipFill>
+                    <a:blip r:embed="rId11"/>
+                    <a:stretch>
+                      <a:fillRect/>
+                    </a:stretch>
+                  </pic:blipFill>
+                  <pic:spPr>
+                    <a:xfrm>
+                      <a:off x="0" y="0"/>
+                      <a:ext cx="5486400" cy="3092097"/>
+                    </a:xfrm>
+                    <a:prstGeom prst="rect"/>
+                  </pic:spPr>
+                </pic:pic>
+              </a:graphicData>
+            </a:graphic>
+          </wp:inline>
+        </w:drawing>
       </w:r>
     </w:p>
     <w:p>

</xml_diff>

<commit_message>
docs(revenue-guide): reframe access sections as already-done, not how-to
The "Getting Jan her own access" sections read like admin instructions for
granting access, but both Stripe and PayPal access were already set up —
Jan/Jez (the doc's actual readers) don't need the how-to steps, just to
know it's done. Also swapped green accents for blue per Tapas's request
and fixed a duplicated closing sentence.
</commit_message>
<xml_diff>
--- a/docs/revenue-reconciliation-guide.docx
+++ b/docs/revenue-reconciliation-guide.docx
@@ -35,7 +35,7 @@
     <w:p>
       <w:pPr>
         <w:pBdr>
-          <w:bottom w:val="single" w:color="467826" w:sz="8" w:space="6"/>
+          <w:bottom w:val="single" w:color="1B5FAE" w:sz="8" w:space="6"/>
         </w:pBdr>
         <w:spacing w:after="60"/>
       </w:pPr>
@@ -172,7 +172,7 @@
         <w:rPr>
           <w:b/>
           <w:bCs/>
-          <w:color w:val="467826"/>
+          <w:color w:val="1B5FAE"/>
           <w:sz w:val="30"/>
           <w:szCs w:val="30"/>
         </w:rPr>
@@ -216,7 +216,7 @@
         <w:tc>
           <w:tcPr>
             <w:tcW w:type="dxa" w:w="1900"/>
-            <w:shd w:fill="467826" w:color="auto" w:val="clear"/>
+            <w:shd w:fill="1B5FAE" w:color="auto" w:val="clear"/>
             <w:tcMar>
               <w:top w:type="dxa" w:w="60"/>
               <w:left w:type="dxa" w:w="120"/>
@@ -243,7 +243,7 @@
         <w:tc>
           <w:tcPr>
             <w:tcW w:type="dxa" w:w="5100"/>
-            <w:shd w:fill="467826" w:color="auto" w:val="clear"/>
+            <w:shd w:fill="1B5FAE" w:color="auto" w:val="clear"/>
             <w:tcMar>
               <w:top w:type="dxa" w:w="60"/>
               <w:left w:type="dxa" w:w="120"/>
@@ -270,7 +270,7 @@
         <w:tc>
           <w:tcPr>
             <w:tcW w:type="dxa" w:w="2360"/>
-            <w:shd w:fill="467826" w:color="auto" w:val="clear"/>
+            <w:shd w:fill="1B5FAE" w:color="auto" w:val="clear"/>
             <w:tcMar>
               <w:top w:type="dxa" w:w="60"/>
               <w:left w:type="dxa" w:w="120"/>
@@ -618,7 +618,7 @@
         <w:rPr>
           <w:b/>
           <w:bCs/>
-          <w:color w:val="467826"/>
+          <w:color w:val="1B5FAE"/>
           <w:sz w:val="30"/>
           <w:szCs w:val="30"/>
         </w:rPr>
@@ -638,20 +638,52 @@
           <w:sz w:val="25"/>
           <w:szCs w:val="25"/>
         </w:rPr>
-        <w:t xml:space="preserve">a) Getting Jan her own access (read-only)</w:t>
-      </w:r>
-    </w:p>
-    <w:p>
-      <w:pPr>
-        <w:spacing w:after="140" w:line="276"/>
-      </w:pPr>
-      <w:r>
-        <w:rPr>
-          <w:color w:val="1C1007"/>
-          <w:sz w:val="22"/>
-          <w:szCs w:val="22"/>
-        </w:rPr>
-        <w:t xml:space="preserve">So Jan can look without needing anyone else, add her as a read-only team member:</w:t>
+        <w:t>a) Jan and Jez's access</w:t>
+      </w:r>
+    </w:p>
+    <w:p>
+      <w:pPr>
+        <w:pBdr>
+          <w:top w:val="dashed" w:color="1B5FAE" w:sz="6" w:space="6"/>
+          <w:bottom w:val="dashed" w:color="1B5FAE" w:sz="6" w:space="6"/>
+          <w:left w:val="dashed" w:color="1B5FAE" w:sz="6" w:space="6"/>
+          <w:right w:val="dashed" w:color="1B5FAE" w:sz="6" w:space="6"/>
+        </w:pBdr>
+        <w:shd w:fill="E8F1FA" w:color="auto" w:val="clear"/>
+        <w:spacing w:after="200" w:before="60" w:line="264"/>
+      </w:pPr>
+      <w:r>
+        <w:rPr>
+          <w:b/>
+          <w:bCs/>
+          <w:color w:val="1B5FAE"/>
+          <w:sz w:val="22"/>
+          <w:szCs w:val="22"/>
+        </w:rPr>
+      </w:r>
+      <w:r>
+        <w:rPr>
+          <w:color w:val="1C1007"/>
+          <w:sz w:val="22"/>
+          <w:szCs w:val="22"/>
+        </w:rPr>
+        <w:t xml:space="preserve">✅ Already done — Jan and Jez were both invited via Tapas’s Stripe account (Jan as Accountant, Jez as Analyst).</w:t>
+      </w:r>
+    </w:p>
+    <w:p>
+      <w:pPr>
+        <w:pStyle w:val="Heading2"/>
+        <w:spacing w:after="100" w:before="220"/>
+      </w:pPr>
+      <w:r>
+        <w:rPr>
+          <w:b/>
+          <w:bCs/>
+          <w:color w:val="1C1007"/>
+          <w:sz w:val="25"/>
+          <w:szCs w:val="25"/>
+        </w:rPr>
+        <w:t xml:space="preserve">b) Seeing who paid what</w:t>
       </w:r>
     </w:p>
     <w:p>
@@ -669,7 +701,7 @@
           <w:sz w:val="22"/>
           <w:szCs w:val="22"/>
         </w:rPr>
-        <w:t xml:space="preserve">In Stripe, open Settings (gear icon, top right) → Team.</w:t>
+        <w:t xml:space="preserve">Payments (left menu) — every individual charge: customer, amount, date, and whether it succeeded, failed, or was refunded.</w:t>
       </w:r>
     </w:p>
     <w:p>
@@ -687,52 +719,7 @@
           <w:sz w:val="22"/>
           <w:szCs w:val="22"/>
         </w:rPr>
-        <w:t xml:space="preserve">Click “Invite”, enter Jan’s email, and choose the Accountant role (view + export, no changes — this is the role we actually used).</w:t>
-      </w:r>
-    </w:p>
-    <w:p>
-      <w:pPr>
-        <w:pBdr>
-          <w:top w:val="dashed" w:color="467826" w:sz="6" w:space="6"/>
-          <w:bottom w:val="dashed" w:color="467826" w:sz="6" w:space="6"/>
-          <w:left w:val="dashed" w:color="467826" w:sz="6" w:space="6"/>
-          <w:right w:val="dashed" w:color="467826" w:sz="6" w:space="6"/>
-        </w:pBdr>
-        <w:shd w:fill="EFF4E9" w:color="auto" w:val="clear"/>
-        <w:spacing w:after="200" w:before="60" w:line="264"/>
-      </w:pPr>
-      <w:r>
-        <w:rPr>
-          <w:b/>
-          <w:bCs/>
-          <w:color w:val="467826"/>
-          <w:sz w:val="22"/>
-          <w:szCs w:val="22"/>
-        </w:rPr>
-      </w:r>
-      <w:r>
-        <w:rPr>
-          <w:color w:val="1C1007"/>
-          <w:sz w:val="22"/>
-          <w:szCs w:val="22"/>
-        </w:rPr>
-        <w:t xml:space="preserve">✅ Already done — Jan and Jez were both invited via Tapas’s Stripe account (Jan as Accountant, Jez as Analyst).</w:t>
-      </w:r>
-    </w:p>
-    <w:p>
-      <w:pPr>
-        <w:pStyle w:val="Heading2"/>
-        <w:spacing w:after="100" w:before="220"/>
-      </w:pPr>
-      <w:r>
-        <w:rPr>
-          <w:b/>
-          <w:bCs/>
-          <w:color w:val="1C1007"/>
-          <w:sz w:val="25"/>
-          <w:szCs w:val="25"/>
-        </w:rPr>
-        <w:t xml:space="preserve">b) Seeing who paid what</w:t>
+        <w:t xml:space="preserve">Subscriptions (or Billing → Subscriptions) — each active membership, its plan, price, and next renewal date.</w:t>
       </w:r>
     </w:p>
     <w:p>
@@ -750,61 +737,25 @@
           <w:sz w:val="22"/>
           <w:szCs w:val="22"/>
         </w:rPr>
-        <w:t xml:space="preserve">Payments (left menu) — every individual charge: customer, amount, date, and whether it succeeded, failed, or was refunded.</w:t>
-      </w:r>
-    </w:p>
-    <w:p>
-      <w:pPr>
-        <w:pStyle w:val="ListParagraph"/>
-        <w:numPr>
-          <w:ilvl w:val="0"/>
-          <w:numId w:val="1"/>
-        </w:numPr>
-        <w:spacing w:after="90" w:line="268"/>
-      </w:pPr>
-      <w:r>
-        <w:rPr>
-          <w:color w:val="1C1007"/>
-          <w:sz w:val="22"/>
-          <w:szCs w:val="22"/>
-        </w:rPr>
-        <w:t xml:space="preserve">Subscriptions (or Billing → Subscriptions) — each active membership, its plan, price, and next renewal date.</w:t>
-      </w:r>
-    </w:p>
-    <w:p>
-      <w:pPr>
-        <w:pStyle w:val="ListParagraph"/>
-        <w:numPr>
-          <w:ilvl w:val="0"/>
-          <w:numId w:val="1"/>
-        </w:numPr>
-        <w:spacing w:after="90" w:line="268"/>
-      </w:pPr>
-      <w:r>
-        <w:rPr>
-          <w:color w:val="1C1007"/>
-          <w:sz w:val="22"/>
-          <w:szCs w:val="22"/>
-        </w:rPr>
         <w:t xml:space="preserve">Customers — look up one person and see their full payment history.</w:t>
       </w:r>
     </w:p>
     <w:p>
       <w:pPr>
         <w:pBdr>
-          <w:top w:val="dashed" w:color="467826" w:sz="6" w:space="6"/>
-          <w:bottom w:val="dashed" w:color="467826" w:sz="6" w:space="6"/>
-          <w:left w:val="dashed" w:color="467826" w:sz="6" w:space="6"/>
-          <w:right w:val="dashed" w:color="467826" w:sz="6" w:space="6"/>
+          <w:top w:val="dashed" w:color="1B5FAE" w:sz="6" w:space="6"/>
+          <w:bottom w:val="dashed" w:color="1B5FAE" w:sz="6" w:space="6"/>
+          <w:left w:val="dashed" w:color="1B5FAE" w:sz="6" w:space="6"/>
+          <w:right w:val="dashed" w:color="1B5FAE" w:sz="6" w:space="6"/>
         </w:pBdr>
-        <w:shd w:fill="EFF4E9" w:color="auto" w:val="clear"/>
+        <w:shd w:fill="E8F1FA" w:color="auto" w:val="clear"/>
         <w:spacing w:after="200" w:before="60" w:line="264"/>
       </w:pPr>
       <w:r>
         <w:rPr>
           <w:b/>
           <w:bCs/>
-          <w:color w:val="467826"/>
+          <w:color w:val="1B5FAE"/>
           <w:sz w:val="22"/>
           <w:szCs w:val="22"/>
         </w:rPr>
@@ -909,19 +860,19 @@
     <w:p>
       <w:pPr>
         <w:pBdr>
-          <w:top w:val="dashed" w:color="467826" w:sz="6" w:space="6"/>
-          <w:bottom w:val="dashed" w:color="467826" w:sz="6" w:space="6"/>
-          <w:left w:val="dashed" w:color="467826" w:sz="6" w:space="6"/>
-          <w:right w:val="dashed" w:color="467826" w:sz="6" w:space="6"/>
+          <w:top w:val="dashed" w:color="1B5FAE" w:sz="6" w:space="6"/>
+          <w:bottom w:val="dashed" w:color="1B5FAE" w:sz="6" w:space="6"/>
+          <w:left w:val="dashed" w:color="1B5FAE" w:sz="6" w:space="6"/>
+          <w:right w:val="dashed" w:color="1B5FAE" w:sz="6" w:space="6"/>
         </w:pBdr>
-        <w:shd w:fill="EFF4E9" w:color="auto" w:val="clear"/>
+        <w:shd w:fill="E8F1FA" w:color="auto" w:val="clear"/>
         <w:spacing w:after="200" w:before="60" w:line="264"/>
       </w:pPr>
       <w:r>
         <w:rPr>
           <w:b/>
           <w:bCs/>
-          <w:color w:val="467826"/>
+          <w:color w:val="1B5FAE"/>
           <w:sz w:val="22"/>
           <w:szCs w:val="22"/>
         </w:rPr>
@@ -980,7 +931,7 @@
         <w:rPr>
           <w:b/>
           <w:bCs/>
-          <w:color w:val="467826"/>
+          <w:color w:val="1B5FAE"/>
           <w:sz w:val="30"/>
           <w:szCs w:val="30"/>
         </w:rPr>
@@ -1057,19 +1008,19 @@
     <w:p>
       <w:pPr>
         <w:pBdr>
-          <w:top w:val="dashed" w:color="467826" w:sz="6" w:space="6"/>
-          <w:bottom w:val="dashed" w:color="467826" w:sz="6" w:space="6"/>
-          <w:left w:val="dashed" w:color="467826" w:sz="6" w:space="6"/>
-          <w:right w:val="dashed" w:color="467826" w:sz="6" w:space="6"/>
+          <w:top w:val="dashed" w:color="1B5FAE" w:sz="6" w:space="6"/>
+          <w:bottom w:val="dashed" w:color="1B5FAE" w:sz="6" w:space="6"/>
+          <w:left w:val="dashed" w:color="1B5FAE" w:sz="6" w:space="6"/>
+          <w:right w:val="dashed" w:color="1B5FAE" w:sz="6" w:space="6"/>
         </w:pBdr>
-        <w:shd w:fill="EFF4E9" w:color="auto" w:val="clear"/>
+        <w:shd w:fill="E8F1FA" w:color="auto" w:val="clear"/>
         <w:spacing w:after="200" w:before="60" w:line="264"/>
       </w:pPr>
       <w:r>
         <w:rPr>
           <w:b/>
           <w:bCs/>
-          <w:color w:val="467826"/>
+          <w:color w:val="1B5FAE"/>
           <w:sz w:val="22"/>
           <w:szCs w:val="22"/>
         </w:rPr>
@@ -1128,7 +1079,7 @@
         <w:rPr>
           <w:b/>
           <w:bCs/>
-          <w:color w:val="467826"/>
+          <w:color w:val="1B5FAE"/>
           <w:sz w:val="30"/>
           <w:szCs w:val="30"/>
         </w:rPr>
@@ -1148,7 +1099,7 @@
           <w:sz w:val="25"/>
           <w:szCs w:val="25"/>
         </w:rPr>
-        <w:t xml:space="preserve">a) Getting Jan her own access (view-only)</w:t>
+        <w:t>a) Jan and Jez's access</w:t>
       </w:r>
     </w:p>
     <w:p>
@@ -1161,79 +1112,73 @@
           <w:sz w:val="22"/>
           <w:szCs w:val="22"/>
         </w:rPr>
-        <w:t xml:space="preserve">To give Jan her own login, add her under </w:t>
-      </w:r>
-      <w:r>
-        <w:rPr>
-          <w:b/>
-          <w:bCs/>
-          <w:color w:val="1C1007"/>
-          <w:sz w:val="22"/>
-          <w:szCs w:val="22"/>
-        </w:rPr>
-        <w:t xml:space="preserve">Account Settings → Manage users → Add user</w:t>
-      </w:r>
-      <w:r>
-        <w:rPr>
-          <w:color w:val="1C1007"/>
-          <w:sz w:val="22"/>
-          <w:szCs w:val="22"/>
-        </w:rPr>
-        <w:t xml:space="preserve">, then choose her privileges. PayPal is a bit more restrictive than Stripe here: a user can be given permission to </w:t>
-      </w:r>
-      <w:r>
-        <w:rPr>
-          <w:b/>
-          <w:bCs/>
-          <w:color w:val="1C1007"/>
-          <w:sz w:val="22"/>
-          <w:szCs w:val="22"/>
-        </w:rPr>
-        <w:t xml:space="preserve">view the account balance</w:t>
-      </w:r>
-      <w:r>
-        <w:rPr>
-          <w:color w:val="1C1007"/>
-          <w:sz w:val="22"/>
-          <w:szCs w:val="22"/>
-        </w:rPr>
-        <w:t xml:space="preserve">, or separately, permission to </w:t>
-      </w:r>
-      <w:r>
-        <w:rPr>
-          <w:b/>
-          <w:bCs/>
-          <w:color w:val="1C1007"/>
-          <w:sz w:val="22"/>
-          <w:szCs w:val="22"/>
-        </w:rPr>
-        <w:t xml:space="preserve">run and download reports</w:t>
-      </w:r>
-      <w:r>
-        <w:rPr>
-          <w:color w:val="1C1007"/>
-          <w:sz w:val="22"/>
-          <w:szCs w:val="22"/>
-        </w:rPr>
-        <w:t xml:space="preserve"> — PayPal doesn’t allow combining those two on one login. If Jan needs both, the simple fix is two limited logins for her (one for balance, one for reports); either way, she never gets permission to move money.</w:t>
+        <w:t>Jan and Jez have also been added on the PayPal side. PayPal is a bit more restrictive than Stripe here — a login can be given permission to view the account balance, or separately, permission to run and download reports, but not both on one login. If Jan needs both, that just means two separate logins for her; either way, no login can move money.</w:t>
+      </w:r>
+      <w:r>
+        <w:rPr>
+          <w:b/>
+          <w:bCs/>
+          <w:color w:val="1C1007"/>
+          <w:sz w:val="22"/>
+          <w:szCs w:val="22"/>
+        </w:rPr>
+      </w:r>
+      <w:r>
+        <w:rPr>
+          <w:color w:val="1C1007"/>
+          <w:sz w:val="22"/>
+          <w:szCs w:val="22"/>
+        </w:rPr>
+      </w:r>
+      <w:r>
+        <w:rPr>
+          <w:b/>
+          <w:bCs/>
+          <w:color w:val="1C1007"/>
+          <w:sz w:val="22"/>
+          <w:szCs w:val="22"/>
+        </w:rPr>
+      </w:r>
+      <w:r>
+        <w:rPr>
+          <w:color w:val="1C1007"/>
+          <w:sz w:val="22"/>
+          <w:szCs w:val="22"/>
+        </w:rPr>
+      </w:r>
+      <w:r>
+        <w:rPr>
+          <w:b/>
+          <w:bCs/>
+          <w:color w:val="1C1007"/>
+          <w:sz w:val="22"/>
+          <w:szCs w:val="22"/>
+        </w:rPr>
+      </w:r>
+      <w:r>
+        <w:rPr>
+          <w:color w:val="1C1007"/>
+          <w:sz w:val="22"/>
+          <w:szCs w:val="22"/>
+        </w:rPr>
       </w:r>
     </w:p>
     <w:p>
       <w:pPr>
         <w:pBdr>
-          <w:top w:val="dashed" w:color="467826" w:sz="6" w:space="6"/>
-          <w:bottom w:val="dashed" w:color="467826" w:sz="6" w:space="6"/>
-          <w:left w:val="dashed" w:color="467826" w:sz="6" w:space="6"/>
-          <w:right w:val="dashed" w:color="467826" w:sz="6" w:space="6"/>
+          <w:top w:val="dashed" w:color="1B5FAE" w:sz="6" w:space="6"/>
+          <w:bottom w:val="dashed" w:color="1B5FAE" w:sz="6" w:space="6"/>
+          <w:left w:val="dashed" w:color="1B5FAE" w:sz="6" w:space="6"/>
+          <w:right w:val="dashed" w:color="1B5FAE" w:sz="6" w:space="6"/>
         </w:pBdr>
-        <w:shd w:fill="EFF4E9" w:color="auto" w:val="clear"/>
+        <w:shd w:fill="E8F1FA" w:color="auto" w:val="clear"/>
         <w:spacing w:after="200" w:before="60" w:line="264"/>
       </w:pPr>
       <w:r>
         <w:rPr>
           <w:b/>
           <w:bCs/>
-          <w:color w:val="467826"/>
+          <w:color w:val="1B5FAE"/>
           <w:sz w:val="22"/>
           <w:szCs w:val="22"/>
         </w:rPr>
@@ -1356,19 +1301,19 @@
     <w:p>
       <w:pPr>
         <w:pBdr>
-          <w:top w:val="dashed" w:color="467826" w:sz="6" w:space="6"/>
-          <w:bottom w:val="dashed" w:color="467826" w:sz="6" w:space="6"/>
-          <w:left w:val="dashed" w:color="467826" w:sz="6" w:space="6"/>
-          <w:right w:val="dashed" w:color="467826" w:sz="6" w:space="6"/>
+          <w:top w:val="dashed" w:color="1B5FAE" w:sz="6" w:space="6"/>
+          <w:bottom w:val="dashed" w:color="1B5FAE" w:sz="6" w:space="6"/>
+          <w:left w:val="dashed" w:color="1B5FAE" w:sz="6" w:space="6"/>
+          <w:right w:val="dashed" w:color="1B5FAE" w:sz="6" w:space="6"/>
         </w:pBdr>
-        <w:shd w:fill="EFF4E9" w:color="auto" w:val="clear"/>
+        <w:shd w:fill="E8F1FA" w:color="auto" w:val="clear"/>
         <w:spacing w:after="200" w:before="60" w:line="264"/>
       </w:pPr>
       <w:r>
         <w:rPr>
           <w:b/>
           <w:bCs/>
-          <w:color w:val="467826"/>
+          <w:color w:val="1B5FAE"/>
           <w:sz w:val="22"/>
           <w:szCs w:val="22"/>
         </w:rPr>
@@ -1427,7 +1372,7 @@
         <w:rPr>
           <w:b/>
           <w:bCs/>
-          <w:color w:val="467826"/>
+          <w:color w:val="1B5FAE"/>
           <w:sz w:val="30"/>
           <w:szCs w:val="30"/>
         </w:rPr>
@@ -1486,19 +1431,19 @@
     <w:p>
       <w:pPr>
         <w:pBdr>
-          <w:top w:val="dashed" w:color="467826" w:sz="6" w:space="6"/>
-          <w:bottom w:val="dashed" w:color="467826" w:sz="6" w:space="6"/>
-          <w:left w:val="dashed" w:color="467826" w:sz="6" w:space="6"/>
-          <w:right w:val="dashed" w:color="467826" w:sz="6" w:space="6"/>
+          <w:top w:val="dashed" w:color="1B5FAE" w:sz="6" w:space="6"/>
+          <w:bottom w:val="dashed" w:color="1B5FAE" w:sz="6" w:space="6"/>
+          <w:left w:val="dashed" w:color="1B5FAE" w:sz="6" w:space="6"/>
+          <w:right w:val="dashed" w:color="1B5FAE" w:sz="6" w:space="6"/>
         </w:pBdr>
-        <w:shd w:fill="EFF4E9" w:color="auto" w:val="clear"/>
+        <w:shd w:fill="E8F1FA" w:color="auto" w:val="clear"/>
         <w:spacing w:after="200" w:before="60" w:line="264"/>
       </w:pPr>
       <w:r>
         <w:rPr>
           <w:b/>
           <w:bCs/>
-          <w:color w:val="467826"/>
+          <w:color w:val="1B5FAE"/>
           <w:sz w:val="22"/>
           <w:szCs w:val="22"/>
         </w:rPr>
@@ -1522,7 +1467,7 @@
         <w:rPr>
           <w:b/>
           <w:bCs/>
-          <w:color w:val="467826"/>
+          <w:color w:val="1B5FAE"/>
           <w:sz w:val="30"/>
           <w:szCs w:val="30"/>
         </w:rPr>
@@ -1731,7 +1676,7 @@
         <w:rPr>
           <w:b/>
           <w:bCs/>
-          <w:color w:val="467826"/>
+          <w:color w:val="1B5FAE"/>
           <w:sz w:val="30"/>
           <w:szCs w:val="30"/>
         </w:rPr>
@@ -1848,7 +1793,6 @@
           <w:sz w:val="22"/>
           <w:szCs w:val="22"/>
         </w:rPr>
-        <w:t xml:space="preserve">Questions on any screen or number? </w:t>
       </w:r>
       <w:r>
         <w:rPr>
@@ -1856,7 +1800,7 @@
           <w:sz w:val="22"/>
           <w:szCs w:val="22"/>
         </w:rPr>
-        <w:t xml:space="preserve">Happy to jump on a short call and walk through it together, doc in hand. — Siyoul</w:t>
+        <w:t>Questions on any screen or number? Feel free to reach out anytime by email. — Siyoul</w:t>
       </w:r>
     </w:p>
     <w:sectPr>

</xml_diff>

<commit_message>
docs(revenue-guide): drop the WooCommerce-comparison section
Removed section 6 entirely instead of trimming it:
- The "recurring, not one-off" claim was flatly wrong (WooCommerce does
  support subscriptions) and had no verified basis to correct it.
- The remaining gross/net and charge-vs-payout-date explanations were
  basic accounting concepts an actual accountant (Jan) doesn't need
  spelled out.
- "Two sources now" duplicated section 1's table.
- The one genuinely useful bit (terminology mapping) moved into section
  2's intro instead of needing its own comparison section.
</commit_message>
<xml_diff>
--- a/docs/revenue-reconciliation-guide.docx
+++ b/docs/revenue-reconciliation-guide.docx
@@ -626,6 +626,14 @@
       </w:r>
     </w:p>
     <w:p>
+      <w:r>
+        <w:rPr>
+          <w:i/>
+        </w:rPr>
+        <w:t>Quick note on terms: Stripe splits what you might call one “order” into several labels — customer, subscription, invoice, charge, payout — depending on what you're looking at. Same idea, just labeled per step below.</w:t>
+      </w:r>
+    </w:p>
+    <w:p>
       <w:pPr>
         <w:pStyle w:val="Heading2"/>
         <w:spacing w:after="100" w:before="220"/>
@@ -1471,216 +1479,7 @@
           <w:sz w:val="30"/>
           <w:szCs w:val="30"/>
         </w:rPr>
-        <w:t xml:space="preserve">6.  How this differs from WooCommerce</w:t>
-      </w:r>
-    </w:p>
-    <w:p>
-      <w:pPr>
-        <w:spacing w:after="140" w:line="276"/>
-      </w:pPr>
-      <w:r>
-        <w:rPr>
-          <w:color w:val="1C1007"/>
-          <w:sz w:val="22"/>
-          <w:szCs w:val="22"/>
-        </w:rPr>
-        <w:t>A few things look different from the old system — worth knowing so the numbers make sense. This part is based on our general understanding of how WooCommerce works, not a detailed look at your specific setup, so please flag anything below that does not match how you actually reconcile today:</w:t>
-      </w:r>
-    </w:p>
-    <w:p>
-      <w:pPr>
-        <w:pStyle w:val="ListParagraph"/>
-        <w:numPr>
-          <w:ilvl w:val="0"/>
-          <w:numId w:val="1"/>
-        </w:numPr>
-        <w:spacing w:after="90" w:line="268"/>
-      </w:pPr>
-      <w:r>
-        <w:rPr>
-          <w:color w:val="1C1007"/>
-          <w:sz w:val="22"/>
-          <w:szCs w:val="22"/>
-        </w:rPr>
-        <w:t xml:space="preserve"/>
-      </w:r>
-      <w:r>
-        <w:rPr>
-          <w:b/>
-          <w:bCs/>
-          <w:color w:val="1C1007"/>
-          <w:sz w:val="22"/>
-          <w:szCs w:val="22"/>
-        </w:rPr>
-        <w:t xml:space="preserve">Two sources now. </w:t>
-      </w:r>
-      <w:r>
-        <w:rPr>
-          <w:color w:val="1C1007"/>
-          <w:sz w:val="22"/>
-          <w:szCs w:val="22"/>
-        </w:rPr>
-        <w:t xml:space="preserve">New members are in Stripe/PayPal; existing members are still in WooCommerce. For a full picture during the overlap, pull from both.</w:t>
-      </w:r>
-    </w:p>
-    <w:p>
-      <w:pPr>
-        <w:pStyle w:val="ListParagraph"/>
-        <w:numPr>
-          <w:ilvl w:val="0"/>
-          <w:numId w:val="1"/>
-        </w:numPr>
-        <w:spacing w:after="90" w:line="268"/>
-      </w:pPr>
-      <w:r>
-        <w:rPr>
-          <w:color w:val="1C1007"/>
-          <w:sz w:val="22"/>
-          <w:szCs w:val="22"/>
-        </w:rPr>
-        <w:t xml:space="preserve"/>
-      </w:r>
-      <w:r>
-        <w:rPr>
-          <w:b/>
-          <w:bCs/>
-          <w:color w:val="1C1007"/>
-          <w:sz w:val="22"/>
-          <w:szCs w:val="22"/>
-        </w:rPr>
-        <w:t xml:space="preserve">Recurring, not one-off. </w:t>
-      </w:r>
-      <w:r>
-        <w:rPr>
-          <w:color w:val="1C1007"/>
-          <w:sz w:val="22"/>
-          <w:szCs w:val="22"/>
-        </w:rPr>
-        <w:t xml:space="preserve">In WooCommerce an order is usually a single record. In Stripe a subscription creates a new charge every period (monthly or yearly), so you’ll see the same member pay again each cycle — that’s normal.</w:t>
-      </w:r>
-    </w:p>
-    <w:p>
-      <w:pPr>
-        <w:pStyle w:val="ListParagraph"/>
-        <w:numPr>
-          <w:ilvl w:val="0"/>
-          <w:numId w:val="1"/>
-        </w:numPr>
-        <w:spacing w:after="90" w:line="268"/>
-      </w:pPr>
-      <w:r>
-        <w:rPr>
-          <w:color w:val="1C1007"/>
-          <w:sz w:val="22"/>
-          <w:szCs w:val="22"/>
-        </w:rPr>
-        <w:t xml:space="preserve"/>
-      </w:r>
-      <w:r>
-        <w:rPr>
-          <w:b/>
-          <w:bCs/>
-          <w:color w:val="1C1007"/>
-          <w:sz w:val="22"/>
-          <w:szCs w:val="22"/>
-        </w:rPr>
-        <w:t xml:space="preserve">Gross vs. net (fees). </w:t>
-      </w:r>
-      <w:r>
-        <w:rPr>
-          <w:color w:val="1C1007"/>
-          <w:sz w:val="22"/>
-          <w:szCs w:val="22"/>
-        </w:rPr>
-        <w:t xml:space="preserve">Stripe and PayPal take a processing fee before paying out, so the bank deposit (net) is a little less than the amount the customer paid (gross). WooCommerce order totals were gross. The CSV exports show both.</w:t>
-      </w:r>
-    </w:p>
-    <w:p>
-      <w:pPr>
-        <w:pStyle w:val="ListParagraph"/>
-        <w:numPr>
-          <w:ilvl w:val="0"/>
-          <w:numId w:val="1"/>
-        </w:numPr>
-        <w:spacing w:after="90" w:line="268"/>
-      </w:pPr>
-      <w:r>
-        <w:rPr>
-          <w:color w:val="1C1007"/>
-          <w:sz w:val="22"/>
-          <w:szCs w:val="22"/>
-        </w:rPr>
-        <w:t xml:space="preserve"/>
-      </w:r>
-      <w:r>
-        <w:rPr>
-          <w:b/>
-          <w:bCs/>
-          <w:color w:val="1C1007"/>
-          <w:sz w:val="22"/>
-          <w:szCs w:val="22"/>
-        </w:rPr>
-        <w:t xml:space="preserve">Charge date vs. payout date. </w:t>
-      </w:r>
-      <w:r>
-        <w:rPr>
-          <w:color w:val="1C1007"/>
-          <w:sz w:val="22"/>
-          <w:szCs w:val="22"/>
-        </w:rPr>
-        <w:t xml:space="preserve">The customer is charged on one day; the money lands in the bank a couple of days later, grouped into a payout. So “revenue this month” and “cash received this month” can differ slightly at month boundaries.</w:t>
-      </w:r>
-    </w:p>
-    <w:p>
-      <w:pPr>
-        <w:pStyle w:val="ListParagraph"/>
-        <w:numPr>
-          <w:ilvl w:val="0"/>
-          <w:numId w:val="1"/>
-        </w:numPr>
-        <w:spacing w:after="90" w:line="268"/>
-      </w:pPr>
-      <w:r>
-        <w:rPr>
-          <w:color w:val="1C1007"/>
-          <w:sz w:val="22"/>
-          <w:szCs w:val="22"/>
-        </w:rPr>
-        <w:t xml:space="preserve"/>
-      </w:r>
-      <w:r>
-        <w:rPr>
-          <w:b/>
-          <w:bCs/>
-          <w:color w:val="1C1007"/>
-          <w:sz w:val="22"/>
-          <w:szCs w:val="22"/>
-        </w:rPr>
-        <w:t xml:space="preserve">Different words. </w:t>
-      </w:r>
-      <w:r>
-        <w:rPr>
-          <w:color w:val="1C1007"/>
-          <w:sz w:val="22"/>
-          <w:szCs w:val="22"/>
-        </w:rPr>
-        <w:t xml:space="preserve">Stripe says customer / subscription / invoice / charge / payout; WooCommerce said order. They’re the same idea in different clothes.</w:t>
-      </w:r>
-    </w:p>
-    <w:p>
-      <w:pPr>
-        <w:pStyle w:val="Heading1"/>
-        <w:spacing w:after="140" w:before="320"/>
-      </w:pPr>
-      <w:r>
-        <w:rPr>
-          <w:b/>
-          <w:bCs/>
-          <w:color w:val="1B5FAE"/>
-          <w:sz w:val="30"/>
-          <w:szCs w:val="30"/>
-        </w:rPr>
-        <w:t xml:space="preserve">7.  A simple monthly reconciliation checklist</w:t>
+        <w:t>6.  A simple monthly reconciliation checklist</w:t>
       </w:r>
     </w:p>
     <w:p>

</xml_diff>

<commit_message>
docs(revenue-guide): fix subtitle/content mismatch, trim remaining over-explanation
- Subtitle still promised "how it differs from WooCommerce" after that
  section was removed — dropped the claim.
- PayPal section still explained gross-vs-net (the same over-explanation
  cut from the removed WooCommerce section) — trimmed to just the
  practical export step.
- Cut two minor throat-clearing sentences ("Most reconciliation is
  easiest in a spreadsheet", "This is what to match against the bank
  statement") that stated the obvious to an accountant.
</commit_message>
<xml_diff>
--- a/docs/revenue-reconciliation-guide.docx
+++ b/docs/revenue-reconciliation-guide.docx
@@ -47,7 +47,7 @@
           <w:sz w:val="23"/>
           <w:szCs w:val="23"/>
         </w:rPr>
-        <w:t xml:space="preserve">A walkthrough for Jan &amp; Jez — where the money is, and how it differs from WooCommerce</w:t>
+        <w:t>A walkthrough for Jan &amp; Jez — where the money is on the new site</w:t>
       </w:r>
     </w:p>
     <w:p>
@@ -844,7 +844,7 @@
           <w:sz w:val="22"/>
           <w:szCs w:val="22"/>
         </w:rPr>
-        <w:t xml:space="preserve">Balance → Payouts — the actual deposits Stripe sends to the bank, and which payments make up each one. This is what to match against the bank statement.</w:t>
+        <w:t>Balance → Payouts — the actual deposits Stripe sends to the bank, and which payments make up each one.</w:t>
       </w:r>
     </w:p>
     <w:p>
@@ -956,7 +956,7 @@
           <w:sz w:val="22"/>
           <w:szCs w:val="22"/>
         </w:rPr>
-        <w:t xml:space="preserve">Most reconciliation is easiest in a spreadsheet. Stripe exports to CSV in a couple of clicks:</w:t>
+        <w:t>Stripe exports to CSV in a couple of clicks:</w:t>
       </w:r>
     </w:p>
     <w:p>
@@ -1303,7 +1303,7 @@
           <w:sz w:val="22"/>
           <w:szCs w:val="22"/>
         </w:rPr>
-        <w:t>PayPal also deducts a processing fee, so its net deposit is a little less than the gross — same as Stripe. To export, click the circular download icon in the top-right corner of the transactions list (visible in the screenshot below).</w:t>
+        <w:t>To export, click the circular download icon in the top-right corner of the transactions list (visible in the screenshot below).</w:t>
       </w:r>
     </w:p>
     <w:p>

</xml_diff>

<commit_message>
docs(revenue-guide): add login step before Stripe/PayPal navigation
Each access section jumped straight from "already invited" to menu
names without saying to log in first. Added one line per section
pointing at the right login (dashboard.stripe.com / paypal.com, using
the invited email) before the menu walkthrough.
</commit_message>
<xml_diff>
--- a/docs/revenue-reconciliation-guide.docx
+++ b/docs/revenue-reconciliation-guide.docx
@@ -679,6 +679,12 @@
       </w:r>
     </w:p>
     <w:p>
+      <w:r>
+        <w:rPr/>
+        <w:t>Log in at dashboard.stripe.com with the email address you were invited on — you’ll land on the dashboard with Payments, Subscriptions, Balance, and Reports in the left menu.</w:t>
+      </w:r>
+    </w:p>
+    <w:p>
       <w:pPr>
         <w:pStyle w:val="Heading2"/>
         <w:spacing w:after="100" w:before="220"/>
@@ -1169,6 +1175,12 @@
           <w:sz w:val="22"/>
           <w:szCs w:val="22"/>
         </w:rPr>
+      </w:r>
+    </w:p>
+    <w:p>
+      <w:r>
+        <w:rPr/>
+        <w:t>Log in at paypal.com with the email address you were invited on — Activity and Reports are in the top navigation.</w:t>
       </w:r>
     </w:p>
     <w:p>

</xml_diff>